<commit_message>
Add project timeline and costing to architecture docs
Co-authored-by: musokemoses72 <musokemoses72@gmail.com>
</commit_message>
<xml_diff>
--- a/docs/BFH-ERP-Overview-NonTechnical.docx
+++ b/docs/BFH-ERP-Overview-NonTechnical.docx
@@ -770,6 +770,1152 @@
         </w:drawing>
       </w:r>
     </w:p>
+    <w:p>
+      <w:pPr>
+        <w:pStyle w:val="Compact"/>
+        <w:numPr>
+          <w:ilvl w:val="0"/>
+          <w:numId w:val="1017"/>
+        </w:numPr>
+      </w:pPr>
+      <w:r>
+        <w:t xml:space="preserve">Project Timeline (Plain Language)</w:t>
+      </w:r>
+      <w:r>
+        <w:t xml:space="preserve"> </w:t>
+      </w:r>
+      <w:r>
+        <w:t xml:space="preserve">Here is a practical schedule. We keep activities overlapping so we can go live faster. Exact dates will be agreed at kickoff.</w:t>
+      </w:r>
+    </w:p>
+    <w:tbl>
+      <w:tblPr>
+        <w:tblStyle w:val="Table"/>
+        <w:tblW w:type="pct" w:w="5000"/>
+        <w:jc w:val="left"/>
+        <w:tblLayout w:type="fixed"/>
+        <w:tblLook w:firstRow="1" w:lastRow="0" w:firstColumn="0" w:lastColumn="0" w:noHBand="0" w:noVBand="0" w:val="0020"/>
+      </w:tblPr>
+      <w:tblGrid>
+        <w:gridCol w:w="2640"/>
+        <w:gridCol w:w="2640"/>
+        <w:gridCol w:w="2640"/>
+      </w:tblGrid>
+      <w:tr>
+        <w:trPr>
+          <w:tblHeader w:val="on"/>
+        </w:trPr>
+        <w:tc>
+          <w:tcPr/>
+          <w:p>
+            <w:pPr>
+              <w:pStyle w:val="Compact"/>
+              <w:jc w:val="left"/>
+            </w:pPr>
+            <w:r>
+              <w:t xml:space="preserve">Phase</w:t>
+            </w:r>
+          </w:p>
+        </w:tc>
+        <w:tc>
+          <w:tcPr/>
+          <w:p>
+            <w:pPr>
+              <w:pStyle w:val="Compact"/>
+              <w:jc w:val="left"/>
+            </w:pPr>
+            <w:r>
+              <w:t xml:space="preserve">What You’ll See</w:t>
+            </w:r>
+          </w:p>
+        </w:tc>
+        <w:tc>
+          <w:tcPr/>
+          <w:p>
+            <w:pPr>
+              <w:pStyle w:val="Compact"/>
+              <w:jc w:val="left"/>
+            </w:pPr>
+            <w:r>
+              <w:t xml:space="preserve">When</w:t>
+            </w:r>
+          </w:p>
+        </w:tc>
+      </w:tr>
+      <w:tr>
+        <w:tc>
+          <w:tcPr/>
+          <w:p>
+            <w:pPr>
+              <w:pStyle w:val="Compact"/>
+              <w:jc w:val="left"/>
+            </w:pPr>
+            <w:r>
+              <w:t xml:space="preserve">Plan</w:t>
+            </w:r>
+          </w:p>
+        </w:tc>
+        <w:tc>
+          <w:tcPr/>
+          <w:p>
+            <w:pPr>
+              <w:pStyle w:val="Compact"/>
+              <w:jc w:val="left"/>
+            </w:pPr>
+            <w:r>
+              <w:t xml:space="preserve">We map your processes and lock scope</w:t>
+            </w:r>
+          </w:p>
+        </w:tc>
+        <w:tc>
+          <w:tcPr/>
+          <w:p>
+            <w:pPr>
+              <w:pStyle w:val="Compact"/>
+              <w:jc w:val="left"/>
+            </w:pPr>
+            <w:r>
+              <w:t xml:space="preserve">Weeks 1–2</w:t>
+            </w:r>
+          </w:p>
+        </w:tc>
+      </w:tr>
+      <w:tr>
+        <w:tc>
+          <w:tcPr/>
+          <w:p>
+            <w:pPr>
+              <w:pStyle w:val="Compact"/>
+              <w:jc w:val="left"/>
+            </w:pPr>
+            <w:r>
+              <w:t xml:space="preserve">Set Up</w:t>
+            </w:r>
+          </w:p>
+        </w:tc>
+        <w:tc>
+          <w:tcPr/>
+          <w:p>
+            <w:pPr>
+              <w:pStyle w:val="Compact"/>
+              <w:jc w:val="left"/>
+            </w:pPr>
+            <w:r>
+              <w:t xml:space="preserve">Test and live systems, secure access, backups, monitoring</w:t>
+            </w:r>
+          </w:p>
+        </w:tc>
+        <w:tc>
+          <w:tcPr/>
+          <w:p>
+            <w:pPr>
+              <w:pStyle w:val="Compact"/>
+              <w:jc w:val="left"/>
+            </w:pPr>
+            <w:r>
+              <w:t xml:space="preserve">Weeks 2–3</w:t>
+            </w:r>
+          </w:p>
+        </w:tc>
+      </w:tr>
+      <w:tr>
+        <w:tc>
+          <w:tcPr/>
+          <w:p>
+            <w:pPr>
+              <w:pStyle w:val="Compact"/>
+              <w:jc w:val="left"/>
+            </w:pPr>
+            <w:r>
+              <w:t xml:space="preserve">Configure</w:t>
+            </w:r>
+          </w:p>
+        </w:tc>
+        <w:tc>
+          <w:tcPr/>
+          <w:p>
+            <w:pPr>
+              <w:pStyle w:val="Compact"/>
+              <w:jc w:val="left"/>
+            </w:pPr>
+            <w:r>
+              <w:t xml:space="preserve">Finance, Inventory, HR/Payroll, Sales screens and rules</w:t>
+            </w:r>
+          </w:p>
+        </w:tc>
+        <w:tc>
+          <w:tcPr/>
+          <w:p>
+            <w:pPr>
+              <w:pStyle w:val="Compact"/>
+              <w:jc w:val="left"/>
+            </w:pPr>
+            <w:r>
+              <w:t xml:space="preserve">Weeks 3–5</w:t>
+            </w:r>
+          </w:p>
+        </w:tc>
+      </w:tr>
+      <w:tr>
+        <w:tc>
+          <w:tcPr/>
+          <w:p>
+            <w:pPr>
+              <w:pStyle w:val="Compact"/>
+              <w:jc w:val="left"/>
+            </w:pPr>
+            <w:r>
+              <w:t xml:space="preserve">Load Data (Round 1)</w:t>
+            </w:r>
+          </w:p>
+        </w:tc>
+        <w:tc>
+          <w:tcPr/>
+          <w:p>
+            <w:pPr>
+              <w:pStyle w:val="Compact"/>
+              <w:jc w:val="left"/>
+            </w:pPr>
+            <w:r>
+              <w:t xml:space="preserve">We import your masters and opening balances</w:t>
+            </w:r>
+          </w:p>
+        </w:tc>
+        <w:tc>
+          <w:tcPr/>
+          <w:p>
+            <w:pPr>
+              <w:pStyle w:val="Compact"/>
+              <w:jc w:val="left"/>
+            </w:pPr>
+            <w:r>
+              <w:t xml:space="preserve">Weeks 4–6</w:t>
+            </w:r>
+          </w:p>
+        </w:tc>
+      </w:tr>
+      <w:tr>
+        <w:tc>
+          <w:tcPr/>
+          <w:p>
+            <w:pPr>
+              <w:pStyle w:val="Compact"/>
+              <w:jc w:val="left"/>
+            </w:pPr>
+            <w:r>
+              <w:t xml:space="preserve">Tailor &amp; Reports</w:t>
+            </w:r>
+          </w:p>
+        </w:tc>
+        <w:tc>
+          <w:tcPr/>
+          <w:p>
+            <w:pPr>
+              <w:pStyle w:val="Compact"/>
+              <w:jc w:val="left"/>
+            </w:pPr>
+            <w:r>
+              <w:t xml:space="preserve">We adjust forms, approvals, and build key reports</w:t>
+            </w:r>
+          </w:p>
+        </w:tc>
+        <w:tc>
+          <w:tcPr/>
+          <w:p>
+            <w:pPr>
+              <w:pStyle w:val="Compact"/>
+              <w:jc w:val="left"/>
+            </w:pPr>
+            <w:r>
+              <w:t xml:space="preserve">Weeks 5–8</w:t>
+            </w:r>
+          </w:p>
+        </w:tc>
+      </w:tr>
+      <w:tr>
+        <w:tc>
+          <w:tcPr/>
+          <w:p>
+            <w:pPr>
+              <w:pStyle w:val="Compact"/>
+              <w:jc w:val="left"/>
+            </w:pPr>
+            <w:r>
+              <w:t xml:space="preserve">Connect</w:t>
+            </w:r>
+          </w:p>
+        </w:tc>
+        <w:tc>
+          <w:tcPr/>
+          <w:p>
+            <w:pPr>
+              <w:pStyle w:val="Compact"/>
+              <w:jc w:val="left"/>
+            </w:pPr>
+            <w:r>
+              <w:t xml:space="preserve">SMS/WhatsApp, payments/bank (if needed)</w:t>
+            </w:r>
+          </w:p>
+        </w:tc>
+        <w:tc>
+          <w:tcPr/>
+          <w:p>
+            <w:pPr>
+              <w:pStyle w:val="Compact"/>
+              <w:jc w:val="left"/>
+            </w:pPr>
+            <w:r>
+              <w:t xml:space="preserve">Weeks 6–8</w:t>
+            </w:r>
+          </w:p>
+        </w:tc>
+      </w:tr>
+      <w:tr>
+        <w:tc>
+          <w:tcPr/>
+          <w:p>
+            <w:pPr>
+              <w:pStyle w:val="Compact"/>
+              <w:jc w:val="left"/>
+            </w:pPr>
+            <w:r>
+              <w:t xml:space="preserve">Test (UAT)</w:t>
+            </w:r>
+          </w:p>
+        </w:tc>
+        <w:tc>
+          <w:tcPr/>
+          <w:p>
+            <w:pPr>
+              <w:pStyle w:val="Compact"/>
+              <w:jc w:val="left"/>
+            </w:pPr>
+            <w:r>
+              <w:t xml:space="preserve">Your team tests real scenarios, we fix issues</w:t>
+            </w:r>
+          </w:p>
+        </w:tc>
+        <w:tc>
+          <w:tcPr/>
+          <w:p>
+            <w:pPr>
+              <w:pStyle w:val="Compact"/>
+              <w:jc w:val="left"/>
+            </w:pPr>
+            <w:r>
+              <w:t xml:space="preserve">Weeks 8–10</w:t>
+            </w:r>
+          </w:p>
+        </w:tc>
+      </w:tr>
+      <w:tr>
+        <w:tc>
+          <w:tcPr/>
+          <w:p>
+            <w:pPr>
+              <w:pStyle w:val="Compact"/>
+              <w:jc w:val="left"/>
+            </w:pPr>
+            <w:r>
+              <w:t xml:space="preserve">Train</w:t>
+            </w:r>
+          </w:p>
+        </w:tc>
+        <w:tc>
+          <w:tcPr/>
+          <w:p>
+            <w:pPr>
+              <w:pStyle w:val="Compact"/>
+              <w:jc w:val="left"/>
+            </w:pPr>
+            <w:r>
+              <w:t xml:space="preserve">Hands-on training and quick guides</w:t>
+            </w:r>
+          </w:p>
+        </w:tc>
+        <w:tc>
+          <w:tcPr/>
+          <w:p>
+            <w:pPr>
+              <w:pStyle w:val="Compact"/>
+              <w:jc w:val="left"/>
+            </w:pPr>
+            <w:r>
+              <w:t xml:space="preserve">Weeks 9–10</w:t>
+            </w:r>
+          </w:p>
+        </w:tc>
+      </w:tr>
+      <w:tr>
+        <w:tc>
+          <w:tcPr/>
+          <w:p>
+            <w:pPr>
+              <w:pStyle w:val="Compact"/>
+              <w:jc w:val="left"/>
+            </w:pPr>
+            <w:r>
+              <w:t xml:space="preserve">Go Live</w:t>
+            </w:r>
+          </w:p>
+        </w:tc>
+        <w:tc>
+          <w:tcPr/>
+          <w:p>
+            <w:pPr>
+              <w:pStyle w:val="Compact"/>
+              <w:jc w:val="left"/>
+            </w:pPr>
+            <w:r>
+              <w:t xml:space="preserve">Switch to the live system</w:t>
+            </w:r>
+          </w:p>
+        </w:tc>
+        <w:tc>
+          <w:tcPr/>
+          <w:p>
+            <w:pPr>
+              <w:pStyle w:val="Compact"/>
+              <w:jc w:val="left"/>
+            </w:pPr>
+            <w:r>
+              <w:t xml:space="preserve">Week 11</w:t>
+            </w:r>
+          </w:p>
+        </w:tc>
+      </w:tr>
+      <w:tr>
+        <w:tc>
+          <w:tcPr/>
+          <w:p>
+            <w:pPr>
+              <w:pStyle w:val="Compact"/>
+              <w:jc w:val="left"/>
+            </w:pPr>
+            <w:r>
+              <w:t xml:space="preserve">Stabilize</w:t>
+            </w:r>
+          </w:p>
+        </w:tc>
+        <w:tc>
+          <w:tcPr/>
+          <w:p>
+            <w:pPr>
+              <w:pStyle w:val="Compact"/>
+              <w:jc w:val="left"/>
+            </w:pPr>
+            <w:r>
+              <w:t xml:space="preserve">Close support to ensure smooth operations</w:t>
+            </w:r>
+          </w:p>
+        </w:tc>
+        <w:tc>
+          <w:tcPr/>
+          <w:p>
+            <w:pPr>
+              <w:pStyle w:val="Compact"/>
+              <w:jc w:val="left"/>
+            </w:pPr>
+            <w:r>
+              <w:t xml:space="preserve">Weeks 12–13</w:t>
+            </w:r>
+          </w:p>
+        </w:tc>
+      </w:tr>
+    </w:tbl>
+    <w:p>
+      <w:pPr>
+        <w:pStyle w:val="Compact"/>
+        <w:numPr>
+          <w:ilvl w:val="0"/>
+          <w:numId w:val="1018"/>
+        </w:numPr>
+      </w:pPr>
+      <w:r>
+        <w:t xml:space="preserve">Costing (Simple Budget)</w:t>
+      </w:r>
+      <w:r>
+        <w:t xml:space="preserve"> </w:t>
+      </w:r>
+      <w:r>
+        <w:t xml:space="preserve">These are ballpark figures in USD; we’ll fine-tune after the planning workshops.</w:t>
+      </w:r>
+    </w:p>
+    <w:p>
+      <w:pPr>
+        <w:pStyle w:val="FirstParagraph"/>
+      </w:pPr>
+      <w:r>
+        <w:t xml:space="preserve">One-time setup (once only)</w:t>
+      </w:r>
+    </w:p>
+    <w:tbl>
+      <w:tblPr>
+        <w:tblStyle w:val="Table"/>
+        <w:tblW w:type="pct" w:w="5000"/>
+        <w:jc w:val="left"/>
+        <w:tblLayout w:type="fixed"/>
+        <w:tblLook w:firstRow="1" w:lastRow="0" w:firstColumn="0" w:lastColumn="0" w:noHBand="0" w:noVBand="0" w:val="0020"/>
+      </w:tblPr>
+      <w:tblGrid>
+        <w:gridCol w:w="2640"/>
+        <w:gridCol w:w="2640"/>
+        <w:gridCol w:w="2640"/>
+      </w:tblGrid>
+      <w:tr>
+        <w:trPr>
+          <w:tblHeader w:val="on"/>
+        </w:trPr>
+        <w:tc>
+          <w:tcPr/>
+          <w:p>
+            <w:pPr>
+              <w:pStyle w:val="Compact"/>
+              <w:jc w:val="left"/>
+            </w:pPr>
+            <w:r>
+              <w:t xml:space="preserve">Item</w:t>
+            </w:r>
+          </w:p>
+        </w:tc>
+        <w:tc>
+          <w:tcPr/>
+          <w:p>
+            <w:pPr>
+              <w:pStyle w:val="Compact"/>
+              <w:jc w:val="left"/>
+            </w:pPr>
+            <w:r>
+              <w:t xml:space="preserve">What’s included</w:t>
+            </w:r>
+          </w:p>
+        </w:tc>
+        <w:tc>
+          <w:tcPr/>
+          <w:p>
+            <w:pPr>
+              <w:pStyle w:val="Compact"/>
+              <w:jc w:val="left"/>
+            </w:pPr>
+            <w:r>
+              <w:t xml:space="preserve">Amount</w:t>
+            </w:r>
+          </w:p>
+        </w:tc>
+      </w:tr>
+      <w:tr>
+        <w:tc>
+          <w:tcPr/>
+          <w:p>
+            <w:pPr>
+              <w:pStyle w:val="Compact"/>
+              <w:jc w:val="left"/>
+            </w:pPr>
+            <w:r>
+              <w:t xml:space="preserve">Planning</w:t>
+            </w:r>
+          </w:p>
+        </w:tc>
+        <w:tc>
+          <w:tcPr/>
+          <w:p>
+            <w:pPr>
+              <w:pStyle w:val="Compact"/>
+              <w:jc w:val="left"/>
+            </w:pPr>
+            <w:r>
+              <w:t xml:space="preserve">Workshops and delivery plan</w:t>
+            </w:r>
+          </w:p>
+        </w:tc>
+        <w:tc>
+          <w:tcPr/>
+          <w:p>
+            <w:pPr>
+              <w:pStyle w:val="Compact"/>
+              <w:jc w:val="left"/>
+            </w:pPr>
+            <w:r>
+              <w:t xml:space="preserve">$2,000</w:t>
+            </w:r>
+          </w:p>
+        </w:tc>
+      </w:tr>
+      <w:tr>
+        <w:tc>
+          <w:tcPr/>
+          <w:p>
+            <w:pPr>
+              <w:pStyle w:val="Compact"/>
+              <w:jc w:val="left"/>
+            </w:pPr>
+            <w:r>
+              <w:t xml:space="preserve">Set Up</w:t>
+            </w:r>
+          </w:p>
+        </w:tc>
+        <w:tc>
+          <w:tcPr/>
+          <w:p>
+            <w:pPr>
+              <w:pStyle w:val="Compact"/>
+              <w:jc w:val="left"/>
+            </w:pPr>
+            <w:r>
+              <w:t xml:space="preserve">Staging/Production, backups, monitoring</w:t>
+            </w:r>
+          </w:p>
+        </w:tc>
+        <w:tc>
+          <w:tcPr/>
+          <w:p>
+            <w:pPr>
+              <w:pStyle w:val="Compact"/>
+              <w:jc w:val="left"/>
+            </w:pPr>
+            <w:r>
+              <w:t xml:space="preserve">$1,500</w:t>
+            </w:r>
+          </w:p>
+        </w:tc>
+      </w:tr>
+      <w:tr>
+        <w:tc>
+          <w:tcPr/>
+          <w:p>
+            <w:pPr>
+              <w:pStyle w:val="Compact"/>
+              <w:jc w:val="left"/>
+            </w:pPr>
+            <w:r>
+              <w:t xml:space="preserve">Configure</w:t>
+            </w:r>
+          </w:p>
+        </w:tc>
+        <w:tc>
+          <w:tcPr/>
+          <w:p>
+            <w:pPr>
+              <w:pStyle w:val="Compact"/>
+              <w:jc w:val="left"/>
+            </w:pPr>
+            <w:r>
+              <w:t xml:space="preserve">Core modules (Finance, Inventory, HR/Payroll, Sales)</w:t>
+            </w:r>
+          </w:p>
+        </w:tc>
+        <w:tc>
+          <w:tcPr/>
+          <w:p>
+            <w:pPr>
+              <w:pStyle w:val="Compact"/>
+              <w:jc w:val="left"/>
+            </w:pPr>
+            <w:r>
+              <w:t xml:space="preserve">$3,000</w:t>
+            </w:r>
+          </w:p>
+        </w:tc>
+      </w:tr>
+      <w:tr>
+        <w:tc>
+          <w:tcPr/>
+          <w:p>
+            <w:pPr>
+              <w:pStyle w:val="Compact"/>
+              <w:jc w:val="left"/>
+            </w:pPr>
+            <w:r>
+              <w:t xml:space="preserve">Data Load</w:t>
+            </w:r>
+          </w:p>
+        </w:tc>
+        <w:tc>
+          <w:tcPr/>
+          <w:p>
+            <w:pPr>
+              <w:pStyle w:val="Compact"/>
+              <w:jc w:val="left"/>
+            </w:pPr>
+            <w:r>
+              <w:t xml:space="preserve">Masters and openings (trial + final)</w:t>
+            </w:r>
+          </w:p>
+        </w:tc>
+        <w:tc>
+          <w:tcPr/>
+          <w:p>
+            <w:pPr>
+              <w:pStyle w:val="Compact"/>
+              <w:jc w:val="left"/>
+            </w:pPr>
+            <w:r>
+              <w:t xml:space="preserve">$2,500</w:t>
+            </w:r>
+          </w:p>
+        </w:tc>
+      </w:tr>
+      <w:tr>
+        <w:tc>
+          <w:tcPr/>
+          <w:p>
+            <w:pPr>
+              <w:pStyle w:val="Compact"/>
+              <w:jc w:val="left"/>
+            </w:pPr>
+            <w:r>
+              <w:t xml:space="preserve">Tailoring &amp; Reports</w:t>
+            </w:r>
+          </w:p>
+        </w:tc>
+        <w:tc>
+          <w:tcPr/>
+          <w:p>
+            <w:pPr>
+              <w:pStyle w:val="Compact"/>
+              <w:jc w:val="left"/>
+            </w:pPr>
+            <w:r>
+              <w:t xml:space="preserve">Forms, approvals, 6 reports/prints</w:t>
+            </w:r>
+          </w:p>
+        </w:tc>
+        <w:tc>
+          <w:tcPr/>
+          <w:p>
+            <w:pPr>
+              <w:pStyle w:val="Compact"/>
+              <w:jc w:val="left"/>
+            </w:pPr>
+            <w:r>
+              <w:t xml:space="preserve">$4,000</w:t>
+            </w:r>
+          </w:p>
+        </w:tc>
+      </w:tr>
+      <w:tr>
+        <w:tc>
+          <w:tcPr/>
+          <w:p>
+            <w:pPr>
+              <w:pStyle w:val="Compact"/>
+              <w:jc w:val="left"/>
+            </w:pPr>
+            <w:r>
+              <w:t xml:space="preserve">Integrations</w:t>
+            </w:r>
+          </w:p>
+        </w:tc>
+        <w:tc>
+          <w:tcPr/>
+          <w:p>
+            <w:pPr>
+              <w:pStyle w:val="Compact"/>
+              <w:jc w:val="left"/>
+            </w:pPr>
+            <w:r>
+              <w:t xml:space="preserve">SMS/WhatsApp, banking/payments (basic)</w:t>
+            </w:r>
+          </w:p>
+        </w:tc>
+        <w:tc>
+          <w:tcPr/>
+          <w:p>
+            <w:pPr>
+              <w:pStyle w:val="Compact"/>
+              <w:jc w:val="left"/>
+            </w:pPr>
+            <w:r>
+              <w:t xml:space="preserve">$1,500</w:t>
+            </w:r>
+          </w:p>
+        </w:tc>
+      </w:tr>
+      <w:tr>
+        <w:tc>
+          <w:tcPr/>
+          <w:p>
+            <w:pPr>
+              <w:pStyle w:val="Compact"/>
+              <w:jc w:val="left"/>
+            </w:pPr>
+            <w:r>
+              <w:t xml:space="preserve">Training</w:t>
+            </w:r>
+          </w:p>
+        </w:tc>
+        <w:tc>
+          <w:tcPr/>
+          <w:p>
+            <w:pPr>
+              <w:pStyle w:val="Compact"/>
+              <w:jc w:val="left"/>
+            </w:pPr>
+            <w:r>
+              <w:t xml:space="preserve">Two role-based sessions + materials</w:t>
+            </w:r>
+          </w:p>
+        </w:tc>
+        <w:tc>
+          <w:tcPr/>
+          <w:p>
+            <w:pPr>
+              <w:pStyle w:val="Compact"/>
+              <w:jc w:val="left"/>
+            </w:pPr>
+            <w:r>
+              <w:t xml:space="preserve">$1,500</w:t>
+            </w:r>
+          </w:p>
+        </w:tc>
+      </w:tr>
+      <w:tr>
+        <w:tc>
+          <w:tcPr/>
+          <w:p>
+            <w:pPr>
+              <w:pStyle w:val="Compact"/>
+              <w:jc w:val="left"/>
+            </w:pPr>
+            <w:r>
+              <w:t xml:space="preserve">Go Live &amp; Support</w:t>
+            </w:r>
+          </w:p>
+        </w:tc>
+        <w:tc>
+          <w:tcPr/>
+          <w:p>
+            <w:pPr>
+              <w:pStyle w:val="Compact"/>
+              <w:jc w:val="left"/>
+            </w:pPr>
+            <w:r>
+              <w:t xml:space="preserve">Cutover and 2 weeks hypercare</w:t>
+            </w:r>
+          </w:p>
+        </w:tc>
+        <w:tc>
+          <w:tcPr/>
+          <w:p>
+            <w:pPr>
+              <w:pStyle w:val="Compact"/>
+              <w:jc w:val="left"/>
+            </w:pPr>
+            <w:r>
+              <w:t xml:space="preserve">$1,500</w:t>
+            </w:r>
+          </w:p>
+        </w:tc>
+      </w:tr>
+      <w:tr>
+        <w:tc>
+          <w:tcPr/>
+          <w:p>
+            <w:pPr>
+              <w:pStyle w:val="Compact"/>
+              <w:jc w:val="left"/>
+            </w:pPr>
+            <w:r>
+              <w:t xml:space="preserve">Contingency</w:t>
+            </w:r>
+          </w:p>
+        </w:tc>
+        <w:tc>
+          <w:tcPr/>
+          <w:p>
+            <w:pPr>
+              <w:pStyle w:val="Compact"/>
+              <w:jc w:val="left"/>
+            </w:pPr>
+            <w:r>
+              <w:t xml:space="preserve">Buffer for unknowns (~10%)</w:t>
+            </w:r>
+          </w:p>
+        </w:tc>
+        <w:tc>
+          <w:tcPr/>
+          <w:p>
+            <w:pPr>
+              <w:pStyle w:val="Compact"/>
+              <w:jc w:val="left"/>
+            </w:pPr>
+            <w:r>
+              <w:t xml:space="preserve">$1,500</w:t>
+            </w:r>
+          </w:p>
+        </w:tc>
+      </w:tr>
+      <w:tr>
+        <w:tc>
+          <w:tcPr/>
+          <w:p>
+            <w:pPr>
+              <w:pStyle w:val="Compact"/>
+              <w:jc w:val="left"/>
+            </w:pPr>
+            <w:r>
+              <w:t xml:space="preserve">Estimated Total (one-time)</w:t>
+            </w:r>
+          </w:p>
+        </w:tc>
+        <w:tc>
+          <w:tcPr/>
+          <w:p>
+            <w:pPr>
+              <w:pStyle w:val="Compact"/>
+            </w:pPr>
+          </w:p>
+        </w:tc>
+        <w:tc>
+          <w:tcPr/>
+          <w:p>
+            <w:pPr>
+              <w:pStyle w:val="Compact"/>
+              <w:jc w:val="left"/>
+            </w:pPr>
+            <w:r>
+              <w:t xml:space="preserve">$19,000</w:t>
+            </w:r>
+          </w:p>
+        </w:tc>
+      </w:tr>
+    </w:tbl>
+    <w:p>
+      <w:pPr>
+        <w:pStyle w:val="BodyText"/>
+      </w:pPr>
+      <w:r>
+        <w:t xml:space="preserve">Monthly (recurring)</w:t>
+      </w:r>
+    </w:p>
+    <w:tbl>
+      <w:tblPr>
+        <w:tblStyle w:val="Table"/>
+        <w:tblW w:type="auto" w:w="0"/>
+        <w:jc w:val="left"/>
+        <w:tblLook w:firstRow="1" w:lastRow="0" w:firstColumn="0" w:lastColumn="0" w:noHBand="0" w:noVBand="0" w:val="0020"/>
+      </w:tblPr>
+      <w:tblGrid>
+        <w:gridCol w:w="2640"/>
+        <w:gridCol w:w="2640"/>
+        <w:gridCol w:w="2640"/>
+      </w:tblGrid>
+      <w:tr>
+        <w:trPr>
+          <w:tblHeader w:val="on"/>
+        </w:trPr>
+        <w:tc>
+          <w:tcPr/>
+          <w:p>
+            <w:pPr>
+              <w:pStyle w:val="Compact"/>
+              <w:jc w:val="left"/>
+            </w:pPr>
+            <w:r>
+              <w:t xml:space="preserve">Item</w:t>
+            </w:r>
+          </w:p>
+        </w:tc>
+        <w:tc>
+          <w:tcPr/>
+          <w:p>
+            <w:pPr>
+              <w:pStyle w:val="Compact"/>
+              <w:jc w:val="left"/>
+            </w:pPr>
+            <w:r>
+              <w:t xml:space="preserve">What’s included</w:t>
+            </w:r>
+          </w:p>
+        </w:tc>
+        <w:tc>
+          <w:tcPr/>
+          <w:p>
+            <w:pPr>
+              <w:pStyle w:val="Compact"/>
+              <w:jc w:val="left"/>
+            </w:pPr>
+            <w:r>
+              <w:t xml:space="preserve">Amount / month</w:t>
+            </w:r>
+          </w:p>
+        </w:tc>
+      </w:tr>
+      <w:tr>
+        <w:tc>
+          <w:tcPr/>
+          <w:p>
+            <w:pPr>
+              <w:pStyle w:val="Compact"/>
+              <w:jc w:val="left"/>
+            </w:pPr>
+            <w:r>
+              <w:t xml:space="preserve">Cloud &amp; Backups</w:t>
+            </w:r>
+          </w:p>
+        </w:tc>
+        <w:tc>
+          <w:tcPr/>
+          <w:p>
+            <w:pPr>
+              <w:pStyle w:val="Compact"/>
+              <w:jc w:val="left"/>
+            </w:pPr>
+            <w:r>
+              <w:t xml:space="preserve">Hosting and encrypted daily backups</w:t>
+            </w:r>
+          </w:p>
+        </w:tc>
+        <w:tc>
+          <w:tcPr/>
+          <w:p>
+            <w:pPr>
+              <w:pStyle w:val="Compact"/>
+              <w:jc w:val="left"/>
+            </w:pPr>
+            <w:r>
+              <w:t xml:space="preserve">$200</w:t>
+            </w:r>
+          </w:p>
+        </w:tc>
+      </w:tr>
+      <w:tr>
+        <w:tc>
+          <w:tcPr/>
+          <w:p>
+            <w:pPr>
+              <w:pStyle w:val="Compact"/>
+              <w:jc w:val="left"/>
+            </w:pPr>
+            <w:r>
+              <w:t xml:space="preserve">Monitoring</w:t>
+            </w:r>
+          </w:p>
+        </w:tc>
+        <w:tc>
+          <w:tcPr/>
+          <w:p>
+            <w:pPr>
+              <w:pStyle w:val="Compact"/>
+              <w:jc w:val="left"/>
+            </w:pPr>
+            <w:r>
+              <w:t xml:space="preserve">Availability and error alerts</w:t>
+            </w:r>
+          </w:p>
+        </w:tc>
+        <w:tc>
+          <w:tcPr/>
+          <w:p>
+            <w:pPr>
+              <w:pStyle w:val="Compact"/>
+              <w:jc w:val="left"/>
+            </w:pPr>
+            <w:r>
+              <w:t xml:space="preserve">$50</w:t>
+            </w:r>
+          </w:p>
+        </w:tc>
+      </w:tr>
+      <w:tr>
+        <w:tc>
+          <w:tcPr/>
+          <w:p>
+            <w:pPr>
+              <w:pStyle w:val="Compact"/>
+              <w:jc w:val="left"/>
+            </w:pPr>
+            <w:r>
+              <w:t xml:space="preserve">Support</w:t>
+            </w:r>
+          </w:p>
+        </w:tc>
+        <w:tc>
+          <w:tcPr/>
+          <w:p>
+            <w:pPr>
+              <w:pStyle w:val="Compact"/>
+              <w:jc w:val="left"/>
+            </w:pPr>
+            <w:r>
+              <w:t xml:space="preserve">Business-hours support and small changes</w:t>
+            </w:r>
+          </w:p>
+        </w:tc>
+        <w:tc>
+          <w:tcPr/>
+          <w:p>
+            <w:pPr>
+              <w:pStyle w:val="Compact"/>
+              <w:jc w:val="left"/>
+            </w:pPr>
+            <w:r>
+              <w:t xml:space="preserve">$300</w:t>
+            </w:r>
+          </w:p>
+        </w:tc>
+      </w:tr>
+      <w:tr>
+        <w:tc>
+          <w:tcPr/>
+          <w:p>
+            <w:pPr>
+              <w:pStyle w:val="Compact"/>
+              <w:jc w:val="left"/>
+            </w:pPr>
+            <w:r>
+              <w:t xml:space="preserve">Estimated Monthly Total</w:t>
+            </w:r>
+          </w:p>
+        </w:tc>
+        <w:tc>
+          <w:tcPr/>
+          <w:p>
+            <w:pPr>
+              <w:pStyle w:val="Compact"/>
+            </w:pPr>
+          </w:p>
+        </w:tc>
+        <w:tc>
+          <w:tcPr/>
+          <w:p>
+            <w:pPr>
+              <w:pStyle w:val="Compact"/>
+              <w:jc w:val="left"/>
+            </w:pPr>
+            <w:r>
+              <w:t xml:space="preserve">$550</w:t>
+            </w:r>
+          </w:p>
+        </w:tc>
+      </w:tr>
+    </w:tbl>
+    <w:p>
+      <w:pPr>
+        <w:pStyle w:val="BodyText"/>
+      </w:pPr>
+      <w:r>
+        <w:t xml:space="preserve">Notes</w:t>
+      </w:r>
+      <w:r>
+        <w:t xml:space="preserve"> </w:t>
+      </w:r>
+      <w:r>
+        <w:t xml:space="preserve">- Third-party charges (SMS credits, payment gateways, bank APIs) are billed by the providers.</w:t>
+      </w:r>
+      <w:r>
+        <w:t xml:space="preserve"> </w:t>
+      </w:r>
+      <w:r>
+        <w:t xml:space="preserve">- Extra reports/print formats beyond the first six will be quoted.</w:t>
+      </w:r>
+      <w:r>
+        <w:t xml:space="preserve"> </w:t>
+      </w:r>
+      <w:r>
+        <w:t xml:space="preserve">- On-site visits (if needed) are billed at cost.</w:t>
+      </w:r>
+    </w:p>
     <w:sectPr/>
   </w:body>
 </w:document>
@@ -1717,6 +2863,176 @@
       </w:pPr>
     </w:lvl>
   </w:abstractNum>
+  <w:abstractNum w:abstractNumId="994210">
+    <w:nsid w:val="0A994210"/>
+    <w:multiLevelType w:val="multilevel"/>
+    <w:lvl w:ilvl="0">
+      <w:start w:val="10"/>
+      <w:numFmt w:val="decimal"/>
+      <w:lvlText w:val="%1)"/>
+      <w:lvlJc w:val="left"/>
+      <w:pPr>
+        <w:ind w:left="720" w:hanging="480"/>
+      </w:pPr>
+    </w:lvl>
+    <w:lvl w:ilvl="1">
+      <w:start w:val="10"/>
+      <w:numFmt w:val="decimal"/>
+      <w:lvlText w:val="%2)"/>
+      <w:lvlJc w:val="left"/>
+      <w:pPr>
+        <w:ind w:left="1440" w:hanging="480"/>
+      </w:pPr>
+    </w:lvl>
+    <w:lvl w:ilvl="2">
+      <w:start w:val="10"/>
+      <w:numFmt w:val="decimal"/>
+      <w:lvlText w:val="%3)"/>
+      <w:lvlJc w:val="left"/>
+      <w:pPr>
+        <w:ind w:left="2160" w:hanging="480"/>
+      </w:pPr>
+    </w:lvl>
+    <w:lvl w:ilvl="3">
+      <w:start w:val="10"/>
+      <w:numFmt w:val="decimal"/>
+      <w:lvlText w:val="%4)"/>
+      <w:lvlJc w:val="left"/>
+      <w:pPr>
+        <w:ind w:left="2880" w:hanging="480"/>
+      </w:pPr>
+    </w:lvl>
+    <w:lvl w:ilvl="4">
+      <w:start w:val="10"/>
+      <w:numFmt w:val="decimal"/>
+      <w:lvlText w:val="%5)"/>
+      <w:lvlJc w:val="left"/>
+      <w:pPr>
+        <w:ind w:left="3600" w:hanging="480"/>
+      </w:pPr>
+    </w:lvl>
+    <w:lvl w:ilvl="5">
+      <w:start w:val="10"/>
+      <w:numFmt w:val="decimal"/>
+      <w:lvlText w:val="%6)"/>
+      <w:lvlJc w:val="left"/>
+      <w:pPr>
+        <w:ind w:left="4320" w:hanging="480"/>
+      </w:pPr>
+    </w:lvl>
+    <w:lvl w:ilvl="6">
+      <w:start w:val="10"/>
+      <w:numFmt w:val="decimal"/>
+      <w:lvlText w:val="%7)"/>
+      <w:lvlJc w:val="left"/>
+      <w:pPr>
+        <w:ind w:left="5040" w:hanging="480"/>
+      </w:pPr>
+    </w:lvl>
+    <w:lvl w:ilvl="7">
+      <w:start w:val="10"/>
+      <w:numFmt w:val="decimal"/>
+      <w:lvlText w:val="%8)"/>
+      <w:lvlJc w:val="left"/>
+      <w:pPr>
+        <w:ind w:left="5760" w:hanging="480"/>
+      </w:pPr>
+    </w:lvl>
+    <w:lvl w:ilvl="8">
+      <w:start w:val="10"/>
+      <w:numFmt w:val="decimal"/>
+      <w:lvlText w:val="%9)"/>
+      <w:lvlJc w:val="left"/>
+      <w:pPr>
+        <w:ind w:left="6480" w:hanging="480"/>
+      </w:pPr>
+    </w:lvl>
+  </w:abstractNum>
+  <w:abstractNum w:abstractNumId="994211">
+    <w:nsid w:val="0A994211"/>
+    <w:multiLevelType w:val="multilevel"/>
+    <w:lvl w:ilvl="0">
+      <w:start w:val="11"/>
+      <w:numFmt w:val="decimal"/>
+      <w:lvlText w:val="%1)"/>
+      <w:lvlJc w:val="left"/>
+      <w:pPr>
+        <w:ind w:left="720" w:hanging="480"/>
+      </w:pPr>
+    </w:lvl>
+    <w:lvl w:ilvl="1">
+      <w:start w:val="11"/>
+      <w:numFmt w:val="decimal"/>
+      <w:lvlText w:val="%2)"/>
+      <w:lvlJc w:val="left"/>
+      <w:pPr>
+        <w:ind w:left="1440" w:hanging="480"/>
+      </w:pPr>
+    </w:lvl>
+    <w:lvl w:ilvl="2">
+      <w:start w:val="11"/>
+      <w:numFmt w:val="decimal"/>
+      <w:lvlText w:val="%3)"/>
+      <w:lvlJc w:val="left"/>
+      <w:pPr>
+        <w:ind w:left="2160" w:hanging="480"/>
+      </w:pPr>
+    </w:lvl>
+    <w:lvl w:ilvl="3">
+      <w:start w:val="11"/>
+      <w:numFmt w:val="decimal"/>
+      <w:lvlText w:val="%4)"/>
+      <w:lvlJc w:val="left"/>
+      <w:pPr>
+        <w:ind w:left="2880" w:hanging="480"/>
+      </w:pPr>
+    </w:lvl>
+    <w:lvl w:ilvl="4">
+      <w:start w:val="11"/>
+      <w:numFmt w:val="decimal"/>
+      <w:lvlText w:val="%5)"/>
+      <w:lvlJc w:val="left"/>
+      <w:pPr>
+        <w:ind w:left="3600" w:hanging="480"/>
+      </w:pPr>
+    </w:lvl>
+    <w:lvl w:ilvl="5">
+      <w:start w:val="11"/>
+      <w:numFmt w:val="decimal"/>
+      <w:lvlText w:val="%6)"/>
+      <w:lvlJc w:val="left"/>
+      <w:pPr>
+        <w:ind w:left="4320" w:hanging="480"/>
+      </w:pPr>
+    </w:lvl>
+    <w:lvl w:ilvl="6">
+      <w:start w:val="11"/>
+      <w:numFmt w:val="decimal"/>
+      <w:lvlText w:val="%7)"/>
+      <w:lvlJc w:val="left"/>
+      <w:pPr>
+        <w:ind w:left="5040" w:hanging="480"/>
+      </w:pPr>
+    </w:lvl>
+    <w:lvl w:ilvl="7">
+      <w:start w:val="11"/>
+      <w:numFmt w:val="decimal"/>
+      <w:lvlText w:val="%8)"/>
+      <w:lvlJc w:val="left"/>
+      <w:pPr>
+        <w:ind w:left="5760" w:hanging="480"/>
+      </w:pPr>
+    </w:lvl>
+    <w:lvl w:ilvl="8">
+      <w:start w:val="11"/>
+      <w:numFmt w:val="decimal"/>
+      <w:lvlText w:val="%9)"/>
+      <w:lvlJc w:val="left"/>
+      <w:pPr>
+        <w:ind w:left="6480" w:hanging="480"/>
+      </w:pPr>
+    </w:lvl>
+  </w:abstractNum>
   <w:num w:numId="1000">
     <w:abstractNumId w:val="990"/>
   </w:num>
@@ -2010,6 +3326,66 @@
   </w:num>
   <w:num w:numId="1016">
     <w:abstractNumId w:val="991"/>
+  </w:num>
+  <w:num w:numId="1017">
+    <w:abstractNumId w:val="994210"/>
+    <w:lvlOverride w:ilvl="0">
+      <w:startOverride w:val="10"/>
+    </w:lvlOverride>
+    <w:lvlOverride w:ilvl="1">
+      <w:startOverride w:val="10"/>
+    </w:lvlOverride>
+    <w:lvlOverride w:ilvl="2">
+      <w:startOverride w:val="10"/>
+    </w:lvlOverride>
+    <w:lvlOverride w:ilvl="3">
+      <w:startOverride w:val="10"/>
+    </w:lvlOverride>
+    <w:lvlOverride w:ilvl="4">
+      <w:startOverride w:val="10"/>
+    </w:lvlOverride>
+    <w:lvlOverride w:ilvl="5">
+      <w:startOverride w:val="10"/>
+    </w:lvlOverride>
+    <w:lvlOverride w:ilvl="6">
+      <w:startOverride w:val="10"/>
+    </w:lvlOverride>
+    <w:lvlOverride w:ilvl="7">
+      <w:startOverride w:val="10"/>
+    </w:lvlOverride>
+    <w:lvlOverride w:ilvl="8">
+      <w:startOverride w:val="10"/>
+    </w:lvlOverride>
+  </w:num>
+  <w:num w:numId="1018">
+    <w:abstractNumId w:val="994211"/>
+    <w:lvlOverride w:ilvl="0">
+      <w:startOverride w:val="11"/>
+    </w:lvlOverride>
+    <w:lvlOverride w:ilvl="1">
+      <w:startOverride w:val="11"/>
+    </w:lvlOverride>
+    <w:lvlOverride w:ilvl="2">
+      <w:startOverride w:val="11"/>
+    </w:lvlOverride>
+    <w:lvlOverride w:ilvl="3">
+      <w:startOverride w:val="11"/>
+    </w:lvlOverride>
+    <w:lvlOverride w:ilvl="4">
+      <w:startOverride w:val="11"/>
+    </w:lvlOverride>
+    <w:lvlOverride w:ilvl="5">
+      <w:startOverride w:val="11"/>
+    </w:lvlOverride>
+    <w:lvlOverride w:ilvl="6">
+      <w:startOverride w:val="11"/>
+    </w:lvlOverride>
+    <w:lvlOverride w:ilvl="7">
+      <w:startOverride w:val="11"/>
+    </w:lvlOverride>
+    <w:lvlOverride w:ilvl="8">
+      <w:startOverride w:val="11"/>
+    </w:lvlOverride>
   </w:num>
 </w:numbering>
 </file>

</xml_diff>